<commit_message>
implement UART and GPIO output, and LD instruction
</commit_message>
<xml_diff>
--- a/doc/PLAN/斐波那契数列计算模型机指令系统表格​​.docx
+++ b/doc/PLAN/斐波那契数列计算模型机指令系统表格​​.docx
@@ -1432,8 +1432,6 @@
               </w:rPr>
               <w:t>1111</w:t>
             </w:r>
-            <w:bookmarkStart w:id="0" w:name="_GoBack"/>
-            <w:bookmarkEnd w:id="0"/>
           </w:p>
         </w:tc>
         <w:tc>
@@ -2984,12 +2982,6 @@
             <w:insideH w:val="single" w:color="auto" w:sz="4" w:space="0"/>
             <w:insideV w:val="single" w:color="auto" w:sz="4" w:space="0"/>
           </w:tblBorders>
-          <w:tblCellMar>
-            <w:top w:w="0" w:type="dxa"/>
-            <w:left w:w="108" w:type="dxa"/>
-            <w:bottom w:w="0" w:type="dxa"/>
-            <w:right w:w="108" w:type="dxa"/>
-          </w:tblCellMar>
         </w:tblPrEx>
         <w:tc>
           <w:tcPr>
@@ -3434,9 +3426,10 @@
           <w:p>
             <w:r>
               <w:rPr>
-                <w:rFonts w:hint="eastAsia"/>
-              </w:rPr>
-              <w:t>f1</w:t>
+                <w:rFonts w:hint="default"/>
+                <w:lang w:val="en-US" w:eastAsia="zh-CN"/>
+              </w:rPr>
+              <w:t xml:space="preserve">LD   x7, 31(x0) </w:t>
             </w:r>
           </w:p>
         </w:tc>
@@ -3491,9 +3484,62 @@
           <w:p>
             <w:r>
               <w:rPr>
-                <w:rFonts w:hint="eastAsia"/>
-              </w:rPr>
-              <w:t>f2</w:t>
+                <w:rFonts w:hint="default"/>
+                <w:lang w:val="en-US" w:eastAsia="zh-CN"/>
+              </w:rPr>
+              <w:t xml:space="preserve">ST   x3, 0(x7) </w:t>
+            </w:r>
+          </w:p>
+        </w:tc>
+      </w:tr>
+      <w:tr>
+        <w:tblPrEx>
+          <w:tblBorders>
+            <w:top w:val="single" w:color="auto" w:sz="4" w:space="0"/>
+            <w:left w:val="single" w:color="auto" w:sz="4" w:space="0"/>
+            <w:bottom w:val="single" w:color="auto" w:sz="4" w:space="0"/>
+            <w:right w:val="single" w:color="auto" w:sz="4" w:space="0"/>
+            <w:insideH w:val="single" w:color="auto" w:sz="4" w:space="0"/>
+            <w:insideV w:val="single" w:color="auto" w:sz="4" w:space="0"/>
+          </w:tblBorders>
+        </w:tblPrEx>
+        <w:tc>
+          <w:tcPr>
+            <w:tcW w:w="1242" w:type="dxa"/>
+          </w:tcPr>
+          <w:p>
+            <w:pPr>
+              <w:rPr>
+                <w:rFonts w:hint="eastAsia" w:eastAsiaTheme="minorEastAsia"/>
+                <w:lang w:eastAsia="zh-CN"/>
+              </w:rPr>
+            </w:pPr>
+            <w:r>
+              <w:rPr>
+                <w:rFonts w:hint="eastAsia"/>
+              </w:rPr>
+              <w:t>1</w:t>
+            </w:r>
+            <w:r>
+              <w:rPr>
+                <w:rFonts w:hint="eastAsia"/>
+                <w:lang w:val="en-US" w:eastAsia="zh-CN"/>
+              </w:rPr>
+              <w:t>3</w:t>
+            </w:r>
+          </w:p>
+        </w:tc>
+        <w:tc>
+          <w:tcPr>
+            <w:tcW w:w="7280" w:type="dxa"/>
+          </w:tcPr>
+          <w:p>
+            <w:r>
+              <w:rPr>
+                <w:rFonts w:hint="default"/>
+                <w:lang w:val="en-US" w:eastAsia="zh-CN"/>
+              </w:rPr>
+              <w:t>ST   x3, 16(x7)</w:t>
             </w:r>
           </w:p>
         </w:tc>
@@ -3537,7 +3583,7 @@
                 <w:rFonts w:hint="eastAsia"/>
                 <w:lang w:val="en-US" w:eastAsia="zh-CN"/>
               </w:rPr>
-              <w:t>3</w:t>
+              <w:t>4</w:t>
             </w:r>
           </w:p>
         </w:tc>
@@ -3546,11 +3592,18 @@
             <w:tcW w:w="7280" w:type="dxa"/>
           </w:tcPr>
           <w:p>
-            <w:r>
-              <w:rPr>
-                <w:rFonts w:hint="eastAsia"/>
-              </w:rPr>
-              <w:t>f3</w:t>
+            <w:pPr>
+              <w:rPr>
+                <w:rFonts w:hint="default" w:eastAsiaTheme="minorEastAsia"/>
+                <w:lang w:val="en-US" w:eastAsia="zh-CN"/>
+              </w:rPr>
+            </w:pPr>
+            <w:r>
+              <w:rPr>
+                <w:rFonts w:hint="eastAsia"/>
+                <w:lang w:val="en-US" w:eastAsia="zh-CN"/>
+              </w:rPr>
+              <w:t>EI</w:t>
             </w:r>
           </w:p>
         </w:tc>
@@ -3579,22 +3632,16 @@
           <w:p>
             <w:pPr>
               <w:rPr>
-                <w:rFonts w:hint="eastAsia" w:eastAsiaTheme="minorEastAsia"/>
-                <w:lang w:eastAsia="zh-CN"/>
-              </w:rPr>
-            </w:pPr>
-            <w:r>
-              <w:rPr>
-                <w:rFonts w:hint="eastAsia"/>
-              </w:rPr>
-              <w:t>1</w:t>
-            </w:r>
-            <w:r>
-              <w:rPr>
-                <w:rFonts w:hint="eastAsia"/>
-                <w:lang w:val="en-US" w:eastAsia="zh-CN"/>
-              </w:rPr>
-              <w:t>4</w:t>
+                <w:rFonts w:hint="default" w:eastAsiaTheme="minorEastAsia"/>
+                <w:lang w:val="en-US" w:eastAsia="zh-CN"/>
+              </w:rPr>
+            </w:pPr>
+            <w:r>
+              <w:rPr>
+                <w:rFonts w:hint="eastAsia"/>
+                <w:lang w:val="en-US" w:eastAsia="zh-CN"/>
+              </w:rPr>
+              <w:t>15</w:t>
             </w:r>
           </w:p>
         </w:tc>
@@ -3603,12 +3650,24 @@
             <w:tcW w:w="7280" w:type="dxa"/>
           </w:tcPr>
           <w:p>
-            <w:r>
-              <w:rPr>
-                <w:rFonts w:hint="eastAsia"/>
-              </w:rPr>
-              <w:t>f4</w:t>
-            </w:r>
+            <w:pPr>
+              <w:tabs>
+                <w:tab w:val="left" w:pos="321"/>
+              </w:tabs>
+              <w:rPr>
+                <w:rFonts w:hint="default" w:eastAsiaTheme="minorEastAsia"/>
+                <w:lang w:val="en-US" w:eastAsia="zh-CN"/>
+              </w:rPr>
+            </w:pPr>
+            <w:r>
+              <w:rPr>
+                <w:rFonts w:hint="eastAsia"/>
+                <w:lang w:val="en-US" w:eastAsia="zh-CN"/>
+              </w:rPr>
+              <w:t>HALT</w:t>
+            </w:r>
+            <w:bookmarkStart w:id="0" w:name="_GoBack"/>
+            <w:bookmarkEnd w:id="0"/>
           </w:p>
         </w:tc>
       </w:tr>
@@ -3636,17 +3695,10 @@
           <w:p>
             <w:pPr>
               <w:rPr>
-                <w:rFonts w:hint="default" w:eastAsiaTheme="minorEastAsia"/>
-                <w:lang w:val="en-US" w:eastAsia="zh-CN"/>
-              </w:rPr>
-            </w:pPr>
-            <w:r>
-              <w:rPr>
-                <w:rFonts w:hint="eastAsia"/>
-                <w:lang w:val="en-US" w:eastAsia="zh-CN"/>
-              </w:rPr>
-              <w:t>...</w:t>
-            </w:r>
+                <w:rFonts w:hint="eastAsia"/>
+                <w:lang w:val="en-US" w:eastAsia="zh-CN"/>
+              </w:rPr>
+            </w:pPr>
           </w:p>
         </w:tc>
         <w:tc>
@@ -3656,17 +3708,290 @@
           <w:p>
             <w:pPr>
               <w:rPr>
-                <w:rFonts w:hint="default" w:eastAsiaTheme="minorEastAsia"/>
-                <w:lang w:val="en-US" w:eastAsia="zh-CN"/>
-              </w:rPr>
-            </w:pPr>
-            <w:r>
-              <w:rPr>
-                <w:rFonts w:hint="eastAsia"/>
-                <w:lang w:val="en-US" w:eastAsia="zh-CN"/>
-              </w:rPr>
-              <w:t>...</w:t>
-            </w:r>
+                <w:rFonts w:hint="eastAsia"/>
+                <w:lang w:val="en-US" w:eastAsia="zh-CN"/>
+              </w:rPr>
+            </w:pPr>
+          </w:p>
+        </w:tc>
+      </w:tr>
+      <w:tr>
+        <w:tblPrEx>
+          <w:tblBorders>
+            <w:top w:val="single" w:color="auto" w:sz="4" w:space="0"/>
+            <w:left w:val="single" w:color="auto" w:sz="4" w:space="0"/>
+            <w:bottom w:val="single" w:color="auto" w:sz="4" w:space="0"/>
+            <w:right w:val="single" w:color="auto" w:sz="4" w:space="0"/>
+            <w:insideH w:val="single" w:color="auto" w:sz="4" w:space="0"/>
+            <w:insideV w:val="single" w:color="auto" w:sz="4" w:space="0"/>
+          </w:tblBorders>
+          <w:tblCellMar>
+            <w:top w:w="0" w:type="dxa"/>
+            <w:left w:w="108" w:type="dxa"/>
+            <w:bottom w:w="0" w:type="dxa"/>
+            <w:right w:w="108" w:type="dxa"/>
+          </w:tblCellMar>
+        </w:tblPrEx>
+        <w:tc>
+          <w:tcPr>
+            <w:tcW w:w="1242" w:type="dxa"/>
+          </w:tcPr>
+          <w:p>
+            <w:pPr>
+              <w:rPr>
+                <w:rFonts w:hint="eastAsia"/>
+                <w:lang w:val="en-US" w:eastAsia="zh-CN"/>
+              </w:rPr>
+            </w:pPr>
+          </w:p>
+        </w:tc>
+        <w:tc>
+          <w:tcPr>
+            <w:tcW w:w="7280" w:type="dxa"/>
+          </w:tcPr>
+          <w:p>
+            <w:pPr>
+              <w:rPr>
+                <w:rFonts w:hint="eastAsia"/>
+                <w:lang w:val="en-US" w:eastAsia="zh-CN"/>
+              </w:rPr>
+            </w:pPr>
+          </w:p>
+        </w:tc>
+      </w:tr>
+      <w:tr>
+        <w:tblPrEx>
+          <w:tblBorders>
+            <w:top w:val="single" w:color="auto" w:sz="4" w:space="0"/>
+            <w:left w:val="single" w:color="auto" w:sz="4" w:space="0"/>
+            <w:bottom w:val="single" w:color="auto" w:sz="4" w:space="0"/>
+            <w:right w:val="single" w:color="auto" w:sz="4" w:space="0"/>
+            <w:insideH w:val="single" w:color="auto" w:sz="4" w:space="0"/>
+            <w:insideV w:val="single" w:color="auto" w:sz="4" w:space="0"/>
+          </w:tblBorders>
+        </w:tblPrEx>
+        <w:tc>
+          <w:tcPr>
+            <w:tcW w:w="1242" w:type="dxa"/>
+          </w:tcPr>
+          <w:p>
+            <w:pPr>
+              <w:rPr>
+                <w:rFonts w:hint="eastAsia"/>
+                <w:lang w:val="en-US" w:eastAsia="zh-CN"/>
+              </w:rPr>
+            </w:pPr>
+          </w:p>
+        </w:tc>
+        <w:tc>
+          <w:tcPr>
+            <w:tcW w:w="7280" w:type="dxa"/>
+          </w:tcPr>
+          <w:p>
+            <w:pPr>
+              <w:rPr>
+                <w:rFonts w:hint="eastAsia"/>
+                <w:lang w:val="en-US" w:eastAsia="zh-CN"/>
+              </w:rPr>
+            </w:pPr>
+          </w:p>
+        </w:tc>
+      </w:tr>
+      <w:tr>
+        <w:tblPrEx>
+          <w:tblBorders>
+            <w:top w:val="single" w:color="auto" w:sz="4" w:space="0"/>
+            <w:left w:val="single" w:color="auto" w:sz="4" w:space="0"/>
+            <w:bottom w:val="single" w:color="auto" w:sz="4" w:space="0"/>
+            <w:right w:val="single" w:color="auto" w:sz="4" w:space="0"/>
+            <w:insideH w:val="single" w:color="auto" w:sz="4" w:space="0"/>
+            <w:insideV w:val="single" w:color="auto" w:sz="4" w:space="0"/>
+          </w:tblBorders>
+          <w:tblCellMar>
+            <w:top w:w="0" w:type="dxa"/>
+            <w:left w:w="108" w:type="dxa"/>
+            <w:bottom w:w="0" w:type="dxa"/>
+            <w:right w:w="108" w:type="dxa"/>
+          </w:tblCellMar>
+        </w:tblPrEx>
+        <w:tc>
+          <w:tcPr>
+            <w:tcW w:w="1242" w:type="dxa"/>
+          </w:tcPr>
+          <w:p>
+            <w:pPr>
+              <w:rPr>
+                <w:rFonts w:hint="default"/>
+                <w:lang w:val="en-US" w:eastAsia="zh-CN"/>
+              </w:rPr>
+            </w:pPr>
+            <w:r>
+              <w:rPr>
+                <w:rFonts w:hint="eastAsia"/>
+                <w:lang w:val="en-US" w:eastAsia="zh-CN"/>
+              </w:rPr>
+              <w:t>31</w:t>
+            </w:r>
+          </w:p>
+        </w:tc>
+        <w:tc>
+          <w:tcPr>
+            <w:tcW w:w="7280" w:type="dxa"/>
+          </w:tcPr>
+          <w:p>
+            <w:pPr>
+              <w:rPr>
+                <w:rFonts w:hint="default"/>
+                <w:lang w:val="en-US" w:eastAsia="zh-CN"/>
+              </w:rPr>
+            </w:pPr>
+            <w:r>
+              <w:rPr>
+                <w:rFonts w:hint="eastAsia"/>
+                <w:lang w:val="en-US" w:eastAsia="zh-CN"/>
+              </w:rPr>
+              <w:t>FF00</w:t>
+            </w:r>
+          </w:p>
+        </w:tc>
+      </w:tr>
+      <w:tr>
+        <w:tblPrEx>
+          <w:tblBorders>
+            <w:top w:val="single" w:color="auto" w:sz="4" w:space="0"/>
+            <w:left w:val="single" w:color="auto" w:sz="4" w:space="0"/>
+            <w:bottom w:val="single" w:color="auto" w:sz="4" w:space="0"/>
+            <w:right w:val="single" w:color="auto" w:sz="4" w:space="0"/>
+            <w:insideH w:val="single" w:color="auto" w:sz="4" w:space="0"/>
+            <w:insideV w:val="single" w:color="auto" w:sz="4" w:space="0"/>
+          </w:tblBorders>
+        </w:tblPrEx>
+        <w:tc>
+          <w:tcPr>
+            <w:tcW w:w="1242" w:type="dxa"/>
+          </w:tcPr>
+          <w:p>
+            <w:pPr>
+              <w:rPr>
+                <w:rFonts w:hint="eastAsia"/>
+                <w:lang w:val="en-US" w:eastAsia="zh-CN"/>
+              </w:rPr>
+            </w:pPr>
+          </w:p>
+        </w:tc>
+        <w:tc>
+          <w:tcPr>
+            <w:tcW w:w="7280" w:type="dxa"/>
+          </w:tcPr>
+          <w:p>
+            <w:pPr>
+              <w:rPr>
+                <w:rFonts w:hint="eastAsia"/>
+                <w:lang w:val="en-US" w:eastAsia="zh-CN"/>
+              </w:rPr>
+            </w:pPr>
+          </w:p>
+        </w:tc>
+      </w:tr>
+      <w:tr>
+        <w:tblPrEx>
+          <w:tblBorders>
+            <w:top w:val="single" w:color="auto" w:sz="4" w:space="0"/>
+            <w:left w:val="single" w:color="auto" w:sz="4" w:space="0"/>
+            <w:bottom w:val="single" w:color="auto" w:sz="4" w:space="0"/>
+            <w:right w:val="single" w:color="auto" w:sz="4" w:space="0"/>
+            <w:insideH w:val="single" w:color="auto" w:sz="4" w:space="0"/>
+            <w:insideV w:val="single" w:color="auto" w:sz="4" w:space="0"/>
+          </w:tblBorders>
+          <w:tblCellMar>
+            <w:top w:w="0" w:type="dxa"/>
+            <w:left w:w="108" w:type="dxa"/>
+            <w:bottom w:w="0" w:type="dxa"/>
+            <w:right w:w="108" w:type="dxa"/>
+          </w:tblCellMar>
+        </w:tblPrEx>
+        <w:tc>
+          <w:tcPr>
+            <w:tcW w:w="1242" w:type="dxa"/>
+          </w:tcPr>
+          <w:p>
+            <w:pPr>
+              <w:rPr>
+                <w:rFonts w:hint="default"/>
+                <w:lang w:val="en-US" w:eastAsia="zh-CN"/>
+              </w:rPr>
+            </w:pPr>
+            <w:r>
+              <w:rPr>
+                <w:rFonts w:hint="eastAsia"/>
+                <w:lang w:val="en-US" w:eastAsia="zh-CN"/>
+              </w:rPr>
+              <w:t>FF00</w:t>
+            </w:r>
+          </w:p>
+        </w:tc>
+        <w:tc>
+          <w:tcPr>
+            <w:tcW w:w="7280" w:type="dxa"/>
+          </w:tcPr>
+          <w:p>
+            <w:pPr>
+              <w:rPr>
+                <w:rFonts w:hint="default"/>
+                <w:lang w:val="en-US" w:eastAsia="zh-CN"/>
+              </w:rPr>
+            </w:pPr>
+            <w:r>
+              <w:rPr>
+                <w:rFonts w:hint="eastAsia"/>
+                <w:lang w:val="en-US" w:eastAsia="zh-CN"/>
+              </w:rPr>
+              <w:t>F7</w:t>
+            </w:r>
+          </w:p>
+        </w:tc>
+      </w:tr>
+      <w:tr>
+        <w:tblPrEx>
+          <w:tblBorders>
+            <w:top w:val="single" w:color="auto" w:sz="4" w:space="0"/>
+            <w:left w:val="single" w:color="auto" w:sz="4" w:space="0"/>
+            <w:bottom w:val="single" w:color="auto" w:sz="4" w:space="0"/>
+            <w:right w:val="single" w:color="auto" w:sz="4" w:space="0"/>
+            <w:insideH w:val="single" w:color="auto" w:sz="4" w:space="0"/>
+            <w:insideV w:val="single" w:color="auto" w:sz="4" w:space="0"/>
+          </w:tblBorders>
+          <w:tblCellMar>
+            <w:top w:w="0" w:type="dxa"/>
+            <w:left w:w="108" w:type="dxa"/>
+            <w:bottom w:w="0" w:type="dxa"/>
+            <w:right w:w="108" w:type="dxa"/>
+          </w:tblCellMar>
+        </w:tblPrEx>
+        <w:tc>
+          <w:tcPr>
+            <w:tcW w:w="1242" w:type="dxa"/>
+          </w:tcPr>
+          <w:p>
+            <w:pPr>
+              <w:rPr>
+                <w:rFonts w:hint="eastAsia"/>
+                <w:lang w:val="en-US" w:eastAsia="zh-CN"/>
+              </w:rPr>
+            </w:pPr>
+          </w:p>
+        </w:tc>
+        <w:tc>
+          <w:tcPr>
+            <w:tcW w:w="7280" w:type="dxa"/>
+          </w:tcPr>
+          <w:p>
+            <w:pPr>
+              <w:rPr>
+                <w:rFonts w:hint="eastAsia"/>
+                <w:lang w:val="en-US" w:eastAsia="zh-CN"/>
+              </w:rPr>
+            </w:pPr>
           </w:p>
         </w:tc>
       </w:tr>

</xml_diff>